<commit_message>
Two more corrections from the clarity_360ithub run
Check sites/apps.txt, not just the compose APPS list. Being listed in the
bootstrap only means the bench fetches the app; it is installed on the site
only if it appears in apps.txt. The two diverge exactly when someone adds an
app to the compose and the install-app step behind the sentinel is skipped,
which is the silent failure this prompt already warns about - so the check
belongs in discovery, not just the warning.

Run the lint gate against the repo before wiring anything up. Doing this on
clarity_360ithub confirmed compileall and the four ruff rules were clean, so
the pipeline was green on its first run. Had it been red, the right move would
have been to fix or narrow the gate first: a pipeline that fails on day one
teaches everyone to ignore it, which is worse than having no gate.

Co-Authored-By: Claude Opus 5 (1M context) <noreply@anthropic.com>
</commit_message>
<xml_diff>
--- a/docs/CICD-Claude-Prompts.docx
+++ b/docs/CICD-Claude-Prompts.docx
@@ -269,6 +269,26 @@
           <w:rFonts w:ascii="Consolas" w:hAnsi="Consolas"/>
           <w:sz w:val="17"/>
         </w:rPr>
+        <w:t xml:space="preserve">   Also read sites/apps.txt in the web container - being in the compose APPS</w:t>
+      </w:r>
+      <w:r>
+        <w:br/>
+      </w:r>
+      <w:r>
+        <w:rPr>
+          <w:rFonts w:ascii="Consolas" w:hAnsi="Consolas"/>
+          <w:sz w:val="17"/>
+        </w:rPr>
+        <w:t xml:space="preserve">   list is not the same as being installed on the site.</w:t>
+      </w:r>
+      <w:r>
+        <w:br/>
+      </w:r>
+      <w:r>
+        <w:rPr>
+          <w:rFonts w:ascii="Consolas" w:hAnsi="Consolas"/>
+          <w:sz w:val="17"/>
+        </w:rPr>
       </w:r>
       <w:r>
         <w:br/>
@@ -867,6 +887,35 @@
           <w:sz w:val="17"/>
         </w:rPr>
         <w:t>4. How to verify afterwards that the code landed on EVERY target.</w:t>
+      </w:r>
+      <w:r>
+        <w:br/>
+      </w:r>
+      <w:r>
+        <w:rPr>
+          <w:rFonts w:ascii="Consolas" w:hAnsi="Consolas"/>
+          <w:sz w:val="17"/>
+        </w:rPr>
+      </w:r>
+      <w:r>
+        <w:br/>
+      </w:r>
+      <w:r>
+        <w:rPr>
+          <w:rFonts w:ascii="Consolas" w:hAnsi="Consolas"/>
+          <w:sz w:val="17"/>
+        </w:rPr>
+        <w:t>Before I turn it on, run the lint gate against my repo yourself and tell me if</w:t>
+      </w:r>
+      <w:r>
+        <w:br/>
+      </w:r>
+      <w:r>
+        <w:rPr>
+          <w:rFonts w:ascii="Consolas" w:hAnsi="Consolas"/>
+          <w:sz w:val="17"/>
+        </w:rPr>
+        <w:t>it passes. A pipeline that is red on day one teaches everyone to ignore it.</w:t>
       </w:r>
       <w:r>
         <w:br/>

</xml_diff>